<commit_message>
court(fladistctapp4): amicus-brief and petition-for-review re-rendered on the model at HEAD, still reported (fb-595.54.39)
petition-for-review latex 952/953 (the slash break landed; one line read apart in the
PDF text only); amicus-brief unchanged (the list in a quotation, p11).

Co-Authored-By: Claude Opus 5.5 <noreply@anthropic.com>
</commit_message>
<xml_diff>
--- a/courts/eleventh-circuit/florida/state/fourth-district-court-of-appeal/amicus-brief/usage/OUTPUT-amicus-brief.docx
+++ b/courts/eleventh-circuit/florida/state/fourth-district-court-of-appeal/amicus-brief/usage/OUTPUT-amicus-brief.docx
@@ -5178,9 +5178,6 @@
         <w:t xml:space="preserve">It is unquestionable that tens of thousands of women have been subjected to sexual assaults committed by drivers for Uber and Lyft. The frequency and circumstances of these assaults and claims were profiled in an August 6 and 7, 2025 New York Times article entitled, “Uber’s Festering Sexual Assault Problem.”</w:t>
       </w:r>
       <w:r>
-        <w:t xml:space="preserve"> </w:t>
-      </w:r>
-      <w:r>
         <w:rPr>
           <w:rStyle w:val="FootnoteReference"/>
         </w:rPr>
@@ -6879,7 +6876,7 @@
               <w:rPr>
                 <w:u w:val="single"/>
               </w:rPr>
-              <w:t xml:space="preserve"> </w:t>
+              <w:t xml:space="preserve"> </w:t>
             </w:r>
             <w:r>
               <w:rPr>
@@ -8614,7 +8611,7 @@
               <w:rPr>
                 <w:u w:val="single"/>
               </w:rPr>
-              <w:t xml:space="preserve"> </w:t>
+              <w:t xml:space="preserve"> </w:t>
             </w:r>
             <w:r>
               <w:rPr>
@@ -9038,7 +9035,7 @@
               <w:rPr>
                 <w:u w:val="single"/>
               </w:rPr>
-              <w:t xml:space="preserve"> </w:t>
+              <w:t xml:space="preserve"> </w:t>
             </w:r>
             <w:r>
               <w:rPr>
@@ -9360,7 +9357,7 @@
         <w:t xml:space="preserve"> </w:t>
       </w:r>
       <w:r>
-        <w:t xml:space="preserve">Gift link provided here: https://​www.​nytimes.​com/​2025/​08/​06/​business/​uber-​sexual-​assault.​html?​unlocked_article_code=1.​v1A.​sx6v.​ezOnanA2jveX&amp;smid=url-​share</w:t>
+        <w:t xml:space="preserve">Gift link provided here: https://​www.​nytimes.​com/​2025/​08/​06/​business/​uber-​sexual-​assault.​html?​unlocked_article_code=1.​v1A.​sx6v.​ezOnanA2jveX&amp;​smid=url-​share</w:t>
       </w:r>
     </w:p>
   </w:footnote>
@@ -9379,7 +9376,7 @@
         <w:t xml:space="preserve"> </w:t>
       </w:r>
       <w:r>
-        <w:t xml:space="preserve">New York Times, “Uber Cleared Violent Felons to Drive. Passengers Accused them of Rape” (Dec. 22, 2025), Gift link at: https://​www.​nytimes.​com/​2025/​12/​22/​business/​uber-​background-​checks-​sexual-​assault.​html?​unlocked_article_code=1.​v1A.​tp_G.​AGRnu91HVD6u&amp;smid=url-​share</w:t>
+        <w:t xml:space="preserve">New York Times, “Uber Cleared Violent Felons to Drive. Passengers Accused them of Rape” (Dec. 22, 2025), Gift link at: https://​www.​nytimes.​com/​2025/​12/​22/​business/​uber-​background-​checks-​sexual-​assault.​html?​unlocked_article_code=1.​v1A.​tp_G.​AGRnu91HVD6u&amp;​smid=url-​share</w:t>
       </w:r>
     </w:p>
   </w:footnote>

</xml_diff>